<commit_message>
Creación de la documentación
</commit_message>
<xml_diff>
--- a/Documentación SQL/mValiente_jOttonello_mPila_BD_UD4_Proyecto-Transversal.docx
+++ b/Documentación SQL/mValiente_jOttonello_mPila_BD_UD4_Proyecto-Transversal.docx
@@ -10,7 +10,6 @@
           <w:docPartUnique/>
         </w:docPartObj>
       </w:sdtPr>
-      <w:sdtEndPr/>
       <w:sdtContent>
         <w:p>
           <w:r>
@@ -266,7 +265,7 @@
                   </wp:anchor>
                 </w:drawing>
               </mc:Choice>
-              <mc:Fallback xmlns:w16sdtfl="http://schemas.microsoft.com/office/word/2024/wordml/sdtformatlock" xmlns:w16sdtdh="http://schemas.microsoft.com/office/word/2020/wordml/sdtdatahash" xmlns:w16du="http://schemas.microsoft.com/office/word/2023/wordml/word16du" xmlns:w16="http://schemas.microsoft.com/office/word/2018/wordml" xmlns:w16cid="http://schemas.microsoft.com/office/word/2016/wordml/cid" xmlns:w16cex="http://schemas.microsoft.com/office/word/2018/wordml/cex" xmlns:oel="http://schemas.microsoft.com/office/2019/extlst" xmlns:am3d="http://schemas.microsoft.com/office/drawing/2017/model3d" xmlns:aink="http://schemas.microsoft.com/office/drawing/2016/ink" xmlns:cx8="http://schemas.microsoft.com/office/drawing/2016/5/14/chartex" xmlns:cx7="http://schemas.microsoft.com/office/drawing/2016/5/13/chartex" xmlns:cx6="http://schemas.microsoft.com/office/drawing/2016/5/12/chartex" xmlns:cx5="http://schemas.microsoft.com/office/drawing/2016/5/11/chartex" xmlns:cx4="http://schemas.microsoft.com/office/drawing/2016/5/10/chartex" xmlns:cx3="http://schemas.microsoft.com/office/drawing/2016/5/9/chartex" xmlns:cx2="http://schemas.microsoft.com/office/drawing/2015/10/21/chartex" xmlns:cx1="http://schemas.microsoft.com/office/drawing/2015/9/8/chartex">
+              <mc:Fallback xmlns:cx1="http://schemas.microsoft.com/office/drawing/2015/9/8/chartex" xmlns:cx2="http://schemas.microsoft.com/office/drawing/2015/10/21/chartex" xmlns:cx3="http://schemas.microsoft.com/office/drawing/2016/5/9/chartex" xmlns:cx4="http://schemas.microsoft.com/office/drawing/2016/5/10/chartex" xmlns:cx5="http://schemas.microsoft.com/office/drawing/2016/5/11/chartex" xmlns:cx6="http://schemas.microsoft.com/office/drawing/2016/5/12/chartex" xmlns:cx7="http://schemas.microsoft.com/office/drawing/2016/5/13/chartex" xmlns:cx8="http://schemas.microsoft.com/office/drawing/2016/5/14/chartex" xmlns:aink="http://schemas.microsoft.com/office/drawing/2016/ink" xmlns:am3d="http://schemas.microsoft.com/office/drawing/2017/model3d" xmlns:oel="http://schemas.microsoft.com/office/2019/extlst" xmlns:w16cex="http://schemas.microsoft.com/office/word/2018/wordml/cex" xmlns:w16cid="http://schemas.microsoft.com/office/word/2016/wordml/cid" xmlns:w16="http://schemas.microsoft.com/office/word/2018/wordml" xmlns:w16du="http://schemas.microsoft.com/office/word/2023/wordml/word16du" xmlns:w16sdtdh="http://schemas.microsoft.com/office/word/2020/wordml/sdtdatahash" xmlns:w16sdtfl="http://schemas.microsoft.com/office/word/2024/wordml/sdtformatlock">
                 <w:pict>
                   <v:group w14:anchorId="464EC05E" id="Grupo 149" o:spid="_x0000_s1026" style="position:absolute;margin-left:0;margin-top:0;width:8in;height:95.7pt;z-index:251662336;mso-width-percent:941;mso-height-percent:121;mso-top-percent:23;mso-position-horizontal:center;mso-position-horizontal-relative:page;mso-position-vertical-relative:page;mso-width-percent:941;mso-height-percent:121;mso-top-percent:23" coordorigin="" coordsize="73152,12161" o:gfxdata="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">
                     <v:shape id="Rectángulo 51" o:spid="_x0000_s1027" style="position:absolute;width:73152;height:11303;visibility:visible;mso-wrap-style:square;v-text-anchor:middle" coordsize="7312660,1129665" o:gfxdata="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" path="m,l7312660,r,1129665l3619500,733425,,1091565,,xe" fillcolor="#5b9bd5 [3204]" stroked="f" strokeweight="1pt">
@@ -359,7 +358,6 @@
                                   <w:dataBinding w:prefixMappings="xmlns:ns0='http://purl.org/dc/elements/1.1/' xmlns:ns1='http://schemas.openxmlformats.org/package/2006/metadata/core-properties' " w:xpath="/ns1:coreProperties[1]/ns0:creator[1]" w:storeItemID="{6C3C8BC8-F283-45AE-878A-BAB7291924A1}"/>
                                   <w:text/>
                                 </w:sdtPr>
-                                <w:sdtEndPr/>
                                 <w:sdtContent>
                                   <w:p>
                                     <w:pPr>
@@ -377,15 +375,7 @@
                                         <w:sz w:val="28"/>
                                         <w:szCs w:val="28"/>
                                       </w:rPr>
-                                      <w:t xml:space="preserve">Marco Valiente </w:t>
-                                    </w:r>
-                                    <w:r>
-                                      <w:rPr>
-                                        <w:color w:val="595959" w:themeColor="text1" w:themeTint="A6"/>
-                                        <w:sz w:val="28"/>
-                                        <w:szCs w:val="28"/>
-                                      </w:rPr>
-                                      <w:t xml:space="preserve">/ Joaquín </w:t>
+                                      <w:t xml:space="preserve">Marco Valiente / Joaquín </w:t>
                                     </w:r>
                                     <w:proofErr w:type="spellStart"/>
                                     <w:r>
@@ -431,7 +421,6 @@
                                     <w:dataBinding w:prefixMappings="xmlns:ns0='http://schemas.microsoft.com/office/2006/coverPageProps' " w:xpath="/ns0:CoverPageProperties[1]/ns0:CompanyEmail[1]" w:storeItemID="{55AF091B-3C7A-41E3-B477-F2FDAA23CFDA}"/>
                                     <w:text/>
                                   </w:sdtPr>
-                                  <w:sdtEndPr/>
                                   <w:sdtContent>
                                     <w:r>
                                       <w:rPr>
@@ -486,7 +475,6 @@
                             <w:dataBinding w:prefixMappings="xmlns:ns0='http://purl.org/dc/elements/1.1/' xmlns:ns1='http://schemas.openxmlformats.org/package/2006/metadata/core-properties' " w:xpath="/ns1:coreProperties[1]/ns0:creator[1]" w:storeItemID="{6C3C8BC8-F283-45AE-878A-BAB7291924A1}"/>
                             <w:text/>
                           </w:sdtPr>
-                          <w:sdtEndPr/>
                           <w:sdtContent>
                             <w:p>
                               <w:pPr>
@@ -504,15 +492,7 @@
                                   <w:sz w:val="28"/>
                                   <w:szCs w:val="28"/>
                                 </w:rPr>
-                                <w:t xml:space="preserve">Marco Valiente </w:t>
-                              </w:r>
-                              <w:r>
-                                <w:rPr>
-                                  <w:color w:val="595959" w:themeColor="text1" w:themeTint="A6"/>
-                                  <w:sz w:val="28"/>
-                                  <w:szCs w:val="28"/>
-                                </w:rPr>
-                                <w:t xml:space="preserve">/ Joaquín </w:t>
+                                <w:t xml:space="preserve">Marco Valiente / Joaquín </w:t>
                               </w:r>
                               <w:proofErr w:type="spellStart"/>
                               <w:r>
@@ -558,7 +538,6 @@
                               <w:dataBinding w:prefixMappings="xmlns:ns0='http://schemas.microsoft.com/office/2006/coverPageProps' " w:xpath="/ns0:CoverPageProperties[1]/ns0:CompanyEmail[1]" w:storeItemID="{55AF091B-3C7A-41E3-B477-F2FDAA23CFDA}"/>
                               <w:text/>
                             </w:sdtPr>
-                            <w:sdtEndPr/>
                             <w:sdtContent>
                               <w:r>
                                 <w:rPr>
@@ -675,7 +654,6 @@
                                   <w:dataBinding w:prefixMappings="xmlns:ns0='http://schemas.microsoft.com/office/2006/coverPageProps' " w:xpath="/ns0:CoverPageProperties[1]/ns0:Abstract[1]" w:storeItemID="{55AF091B-3C7A-41E3-B477-F2FDAA23CFDA}"/>
                                   <w:text w:multiLine="1"/>
                                 </w:sdtPr>
-                                <w:sdtEndPr/>
                                 <w:sdtContent>
                                   <w:p>
                                     <w:pPr>
@@ -755,7 +733,6 @@
                             <w:dataBinding w:prefixMappings="xmlns:ns0='http://schemas.microsoft.com/office/2006/coverPageProps' " w:xpath="/ns0:CoverPageProperties[1]/ns0:Abstract[1]" w:storeItemID="{55AF091B-3C7A-41E3-B477-F2FDAA23CFDA}"/>
                             <w:text w:multiLine="1"/>
                           </w:sdtPr>
-                          <w:sdtEndPr/>
                           <w:sdtContent>
                             <w:p>
                               <w:pPr>
@@ -904,7 +881,6 @@
                                   <w:dataBinding w:prefixMappings="xmlns:ns0='http://purl.org/dc/elements/1.1/' xmlns:ns1='http://schemas.openxmlformats.org/package/2006/metadata/core-properties' " w:xpath="/ns1:coreProperties[1]/ns0:subject[1]" w:storeItemID="{6C3C8BC8-F283-45AE-878A-BAB7291924A1}"/>
                                   <w:text/>
                                 </w:sdtPr>
-                                <w:sdtEndPr/>
                                 <w:sdtContent>
                                   <w:p>
                                     <w:pPr>
@@ -1006,7 +982,6 @@
                             <w:dataBinding w:prefixMappings="xmlns:ns0='http://purl.org/dc/elements/1.1/' xmlns:ns1='http://schemas.openxmlformats.org/package/2006/metadata/core-properties' " w:xpath="/ns1:coreProperties[1]/ns0:subject[1]" w:storeItemID="{6C3C8BC8-F283-45AE-878A-BAB7291924A1}"/>
                             <w:text/>
                           </w:sdtPr>
-                          <w:sdtEndPr/>
                           <w:sdtContent>
                             <w:p>
                               <w:pPr>
@@ -1855,20 +1830,18 @@
       <w:r>
         <w:br w:type="page"/>
       </w:r>
-      <w:bookmarkStart w:id="1" w:name="_GoBack"/>
-      <w:bookmarkEnd w:id="1"/>
     </w:p>
     <w:p>
       <w:pPr>
         <w:pStyle w:val="Ttulo1"/>
         <w:ind w:firstLine="708"/>
       </w:pPr>
-      <w:bookmarkStart w:id="2" w:name="_Toc228867228"/>
+      <w:bookmarkStart w:id="1" w:name="_Toc228867228"/>
       <w:r>
         <w:lastRenderedPageBreak/>
         <w:t>Memoria del Programa</w:t>
       </w:r>
-      <w:bookmarkEnd w:id="2"/>
+      <w:bookmarkEnd w:id="1"/>
     </w:p>
     <w:p/>
     <w:p/>
@@ -1880,11 +1853,109 @@
           <w:numId w:val="13"/>
         </w:numPr>
       </w:pPr>
-      <w:bookmarkStart w:id="3" w:name="_Toc228867229"/>
+      <w:bookmarkStart w:id="2" w:name="_Toc228867229"/>
       <w:r>
         <w:t>Descripción funcional del Proyecto</w:t>
       </w:r>
+      <w:bookmarkEnd w:id="2"/>
+    </w:p>
+    <w:p/>
+    <w:p>
+      <w:r>
+        <w:t xml:space="preserve">Nuestro proyecto es </w:t>
+      </w:r>
+      <w:proofErr w:type="spellStart"/>
+      <w:r>
+        <w:t>TodoTabla</w:t>
+      </w:r>
+      <w:proofErr w:type="spellEnd"/>
+      <w:r>
+        <w:t xml:space="preserve">, un gestor de proyectos en estilo </w:t>
+      </w:r>
+      <w:proofErr w:type="spellStart"/>
+      <w:r>
+        <w:t>Kanban</w:t>
+      </w:r>
+      <w:proofErr w:type="spellEnd"/>
+      <w:r>
+        <w:t xml:space="preserve"> cuyo propósito es el de servir la modalidad de </w:t>
+      </w:r>
+      <w:proofErr w:type="spellStart"/>
+      <w:r>
+        <w:t>Kanban</w:t>
+      </w:r>
+      <w:proofErr w:type="spellEnd"/>
+      <w:r>
+        <w:t xml:space="preserve"> de una forma más sencilla, útil y controlada para no tener que depender de programas de terceros ajenos o de software de pago para poder tener acceso a las funcionalidades que nos puede ofrecer </w:t>
+      </w:r>
+      <w:proofErr w:type="spellStart"/>
+      <w:r>
+        <w:t>Kanban</w:t>
+      </w:r>
+      <w:proofErr w:type="spellEnd"/>
+      <w:r>
+        <w:t>.</w:t>
+      </w:r>
+    </w:p>
+    <w:p/>
+    <w:p>
+      <w:r>
+        <w:t>A partir de esto, tenemos lo siguiente en nuestro proyecto:</w:t>
+      </w:r>
+    </w:p>
+    <w:p>
+      <w:r>
+        <w:t>Nuestro programa gestiona proyectos, que son realizados por los usu</w:t>
+      </w:r>
+      <w:r>
+        <w:t>arios. Un proyecto puede tener varios</w:t>
+      </w:r>
+      <w:r>
+        <w:t xml:space="preserve"> usuarios, y un usuario puede estar participando en </w:t>
+      </w:r>
+      <w:r>
+        <w:t>varios</w:t>
+      </w:r>
+      <w:r>
+        <w:t xml:space="preserve"> proyectos. Dentro de un proyecto, un usuario puede tener un rol asignado.</w:t>
+      </w:r>
+      <w:r>
+        <w:t xml:space="preserve"> Un usuario es caracterizado por su nombre, apellidos y su email, mientras que un proyecto es caracterizado por su título, su fecha de creación, y la fecha de su descontinuación.</w:t>
+      </w:r>
+      <w:bookmarkStart w:id="3" w:name="_GoBack"/>
       <w:bookmarkEnd w:id="3"/>
+    </w:p>
+    <w:p>
+      <w:r>
+        <w:t xml:space="preserve">Así mismo, nuestro proyecto está compuesto de tareas. Una tarea existe únicamente dentro de un proyecto, y un proyecto puede tener varias tareas activas en un mismo tiempo. </w:t>
+      </w:r>
+      <w:r>
+        <w:t>De forma adicional, una tarea puede estar asociada a un miembro del equipo.</w:t>
+      </w:r>
+    </w:p>
+    <w:p>
+      <w:r>
+        <w:t>Las tareas están caracterizadas por el</w:t>
+      </w:r>
+      <w:r>
+        <w:t xml:space="preserve"> estado en el que se encuentran, que van a ser principalmente el “</w:t>
+      </w:r>
+      <w:proofErr w:type="spellStart"/>
+      <w:r>
+        <w:t>backlog</w:t>
+      </w:r>
+      <w:proofErr w:type="spellEnd"/>
+      <w:r>
+        <w:t>”, “listo”, “en progreso”, “en revisión” y “hecho”, aunque nos interesa la posibilidad de poder ver a futuro la existencia de nuevas tablas.</w:t>
+      </w:r>
+    </w:p>
+    <w:p>
+      <w:r>
+        <w:t>Existe, además, un interés por ver la evolución de una tarea a lo largo del tiempo, c</w:t>
+      </w:r>
+      <w:r>
+        <w:t>omo al ver los cambios de estado por lo que esta ha estado.</w:t>
+      </w:r>
     </w:p>
     <w:p/>
     <w:p/>
@@ -1946,6 +2017,7 @@
       </w:pPr>
       <w:bookmarkStart w:id="7" w:name="_Toc228867233"/>
       <w:r>
+        <w:lastRenderedPageBreak/>
         <w:t>Diagrama de Ingeniería Inversa</w:t>
       </w:r>
       <w:bookmarkEnd w:id="7"/>
@@ -2114,7 +2186,6 @@
         <w:docPartUnique/>
       </w:docPartObj>
     </w:sdtPr>
-    <w:sdtEndPr/>
     <w:sdtContent>
       <w:p>
         <w:pPr>
@@ -2158,7 +2229,6 @@
             <w:dataBinding w:prefixMappings="xmlns:ns0='http://purl.org/dc/elements/1.1/' xmlns:ns1='http://schemas.openxmlformats.org/package/2006/metadata/core-properties' " w:xpath="/ns1:coreProperties[1]/ns0:subject[1]" w:storeItemID="{6C3C8BC8-F283-45AE-878A-BAB7291924A1}"/>
             <w:text/>
           </w:sdtPr>
-          <w:sdtEndPr/>
           <w:sdtContent>
             <w:r>
               <w:rPr>
@@ -2283,7 +2353,7 @@
                                   <w:sz w:val="28"/>
                                   <w:szCs w:val="28"/>
                                 </w:rPr>
-                                <w:t>1</w:t>
+                                <w:t>4</w:t>
                               </w:r>
                               <w:r>
                                 <w:rPr>
@@ -2359,7 +2429,7 @@
                             <w:sz w:val="28"/>
                             <w:szCs w:val="28"/>
                           </w:rPr>
-                          <w:t>1</w:t>
+                          <w:t>4</w:t>
                         </w:r>
                         <w:r>
                           <w:rPr>
@@ -2432,7 +2502,6 @@
         <w:dataBinding w:prefixMappings="xmlns:ns0='http://purl.org/dc/elements/1.1/' xmlns:ns1='http://schemas.openxmlformats.org/package/2006/metadata/core-properties' " w:xpath="/ns1:coreProperties[1]/ns0:title[1]" w:storeItemID="{6C3C8BC8-F283-45AE-878A-BAB7291924A1}"/>
         <w:text/>
       </w:sdtPr>
-      <w:sdtEndPr/>
       <w:sdtContent>
         <w:r>
           <w:rPr>
@@ -2470,7 +2539,6 @@
         <w:dataBinding w:prefixMappings="xmlns:ns0='http://purl.org/dc/elements/1.1/' xmlns:ns1='http://schemas.openxmlformats.org/package/2006/metadata/core-properties' " w:xpath="/ns1:coreProperties[1]/ns0:creator[1]" w:storeItemID="{6C3C8BC8-F283-45AE-878A-BAB7291924A1}"/>
         <w:text/>
       </w:sdtPr>
-      <w:sdtEndPr/>
       <w:sdtContent>
         <w:r>
           <w:rPr>
@@ -4676,6 +4744,7 @@
     <w:rsidRoot w:val="005C35FA"/>
     <w:rsid w:val="00103937"/>
     <w:rsid w:val="00140856"/>
+    <w:rsid w:val="001D5EFE"/>
     <w:rsid w:val="00294C15"/>
     <w:rsid w:val="002B1369"/>
     <w:rsid w:val="0031350C"/>
@@ -5451,7 +5520,7 @@
 </file>
 
 <file path=customXml/itemProps2.xml><?xml version="1.0" encoding="utf-8"?>
-<ds:datastoreItem xmlns:ds="http://schemas.openxmlformats.org/officeDocument/2006/customXml" ds:itemID="{159EB41C-250A-4ED9-BB67-D0ACFE6A2E94}">
+<ds:datastoreItem xmlns:ds="http://schemas.openxmlformats.org/officeDocument/2006/customXml" ds:itemID="{7191FC55-61B7-48B2-88C5-D52CFB0B3A74}">
   <ds:schemaRefs>
     <ds:schemaRef ds:uri="http://schemas.openxmlformats.org/officeDocument/2006/bibliography"/>
   </ds:schemaRefs>

</xml_diff>

<commit_message>
Update del modelo de base de datos
</commit_message>
<xml_diff>
--- a/Documentación SQL/mValiente_jOttonello_mPila_BD_UD4_Proyecto-Transversal.docx
+++ b/Documentación SQL/mValiente_jOttonello_mPila_BD_UD4_Proyecto-Transversal.docx
@@ -10,6 +10,7 @@
           <w:docPartUnique/>
         </w:docPartObj>
       </w:sdtPr>
+      <w:sdtEndPr/>
       <w:sdtContent>
         <w:p>
           <w:r>
@@ -265,7 +266,7 @@
                   </wp:anchor>
                 </w:drawing>
               </mc:Choice>
-              <mc:Fallback xmlns:cx1="http://schemas.microsoft.com/office/drawing/2015/9/8/chartex" xmlns:cx2="http://schemas.microsoft.com/office/drawing/2015/10/21/chartex" xmlns:cx3="http://schemas.microsoft.com/office/drawing/2016/5/9/chartex" xmlns:cx4="http://schemas.microsoft.com/office/drawing/2016/5/10/chartex" xmlns:cx5="http://schemas.microsoft.com/office/drawing/2016/5/11/chartex" xmlns:cx6="http://schemas.microsoft.com/office/drawing/2016/5/12/chartex" xmlns:cx7="http://schemas.microsoft.com/office/drawing/2016/5/13/chartex" xmlns:cx8="http://schemas.microsoft.com/office/drawing/2016/5/14/chartex" xmlns:aink="http://schemas.microsoft.com/office/drawing/2016/ink" xmlns:am3d="http://schemas.microsoft.com/office/drawing/2017/model3d" xmlns:oel="http://schemas.microsoft.com/office/2019/extlst" xmlns:w16cex="http://schemas.microsoft.com/office/word/2018/wordml/cex" xmlns:w16cid="http://schemas.microsoft.com/office/word/2016/wordml/cid" xmlns:w16="http://schemas.microsoft.com/office/word/2018/wordml" xmlns:w16du="http://schemas.microsoft.com/office/word/2023/wordml/word16du" xmlns:w16sdtdh="http://schemas.microsoft.com/office/word/2020/wordml/sdtdatahash" xmlns:w16sdtfl="http://schemas.microsoft.com/office/word/2024/wordml/sdtformatlock">
+              <mc:Fallback xmlns:w16sdtfl="http://schemas.microsoft.com/office/word/2024/wordml/sdtformatlock" xmlns:w16sdtdh="http://schemas.microsoft.com/office/word/2020/wordml/sdtdatahash" xmlns:w16du="http://schemas.microsoft.com/office/word/2023/wordml/word16du" xmlns:w16="http://schemas.microsoft.com/office/word/2018/wordml" xmlns:w16cid="http://schemas.microsoft.com/office/word/2016/wordml/cid" xmlns:w16cex="http://schemas.microsoft.com/office/word/2018/wordml/cex" xmlns:oel="http://schemas.microsoft.com/office/2019/extlst" xmlns:am3d="http://schemas.microsoft.com/office/drawing/2017/model3d" xmlns:aink="http://schemas.microsoft.com/office/drawing/2016/ink" xmlns:cx8="http://schemas.microsoft.com/office/drawing/2016/5/14/chartex" xmlns:cx7="http://schemas.microsoft.com/office/drawing/2016/5/13/chartex" xmlns:cx6="http://schemas.microsoft.com/office/drawing/2016/5/12/chartex" xmlns:cx5="http://schemas.microsoft.com/office/drawing/2016/5/11/chartex" xmlns:cx4="http://schemas.microsoft.com/office/drawing/2016/5/10/chartex" xmlns:cx3="http://schemas.microsoft.com/office/drawing/2016/5/9/chartex" xmlns:cx2="http://schemas.microsoft.com/office/drawing/2015/10/21/chartex" xmlns:cx1="http://schemas.microsoft.com/office/drawing/2015/9/8/chartex">
                 <w:pict>
                   <v:group w14:anchorId="464EC05E" id="Grupo 149" o:spid="_x0000_s1026" style="position:absolute;margin-left:0;margin-top:0;width:8in;height:95.7pt;z-index:251662336;mso-width-percent:941;mso-height-percent:121;mso-top-percent:23;mso-position-horizontal:center;mso-position-horizontal-relative:page;mso-position-vertical-relative:page;mso-width-percent:941;mso-height-percent:121;mso-top-percent:23" coordorigin="" coordsize="73152,12161" o:gfxdata="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">
                     <v:shape id="Rectángulo 51" o:spid="_x0000_s1027" style="position:absolute;width:73152;height:11303;visibility:visible;mso-wrap-style:square;v-text-anchor:middle" coordsize="7312660,1129665" o:gfxdata="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" path="m,l7312660,r,1129665l3619500,733425,,1091565,,xe" fillcolor="#5b9bd5 [3204]" stroked="f" strokeweight="1pt">
@@ -358,6 +359,7 @@
                                   <w:dataBinding w:prefixMappings="xmlns:ns0='http://purl.org/dc/elements/1.1/' xmlns:ns1='http://schemas.openxmlformats.org/package/2006/metadata/core-properties' " w:xpath="/ns1:coreProperties[1]/ns0:creator[1]" w:storeItemID="{6C3C8BC8-F283-45AE-878A-BAB7291924A1}"/>
                                   <w:text/>
                                 </w:sdtPr>
+                                <w:sdtEndPr/>
                                 <w:sdtContent>
                                   <w:p>
                                     <w:pPr>
@@ -421,6 +423,7 @@
                                     <w:dataBinding w:prefixMappings="xmlns:ns0='http://schemas.microsoft.com/office/2006/coverPageProps' " w:xpath="/ns0:CoverPageProperties[1]/ns0:CompanyEmail[1]" w:storeItemID="{55AF091B-3C7A-41E3-B477-F2FDAA23CFDA}"/>
                                     <w:text/>
                                   </w:sdtPr>
+                                  <w:sdtEndPr/>
                                   <w:sdtContent>
                                     <w:r>
                                       <w:rPr>
@@ -654,6 +657,7 @@
                                   <w:dataBinding w:prefixMappings="xmlns:ns0='http://schemas.microsoft.com/office/2006/coverPageProps' " w:xpath="/ns0:CoverPageProperties[1]/ns0:Abstract[1]" w:storeItemID="{55AF091B-3C7A-41E3-B477-F2FDAA23CFDA}"/>
                                   <w:text w:multiLine="1"/>
                                 </w:sdtPr>
+                                <w:sdtEndPr/>
                                 <w:sdtContent>
                                   <w:p>
                                     <w:pPr>
@@ -881,6 +885,7 @@
                                   <w:dataBinding w:prefixMappings="xmlns:ns0='http://purl.org/dc/elements/1.1/' xmlns:ns1='http://schemas.openxmlformats.org/package/2006/metadata/core-properties' " w:xpath="/ns1:coreProperties[1]/ns0:subject[1]" w:storeItemID="{6C3C8BC8-F283-45AE-878A-BAB7291924A1}"/>
                                   <w:text/>
                                 </w:sdtPr>
+                                <w:sdtEndPr/>
                                 <w:sdtContent>
                                   <w:p>
                                     <w:pPr>
@@ -1905,40 +1910,17 @@
     </w:p>
     <w:p>
       <w:r>
-        <w:t>Nuestro programa gestiona proyectos, que son realizados por los usu</w:t>
-      </w:r>
-      <w:r>
-        <w:t>arios. Un proyecto puede tener varios</w:t>
-      </w:r>
-      <w:r>
-        <w:t xml:space="preserve"> usuarios, y un usuario puede estar participando en </w:t>
-      </w:r>
-      <w:r>
-        <w:t>varios</w:t>
-      </w:r>
-      <w:r>
-        <w:t xml:space="preserve"> proyectos. Dentro de un proyecto, un usuario puede tener un rol asignado.</w:t>
-      </w:r>
-      <w:r>
-        <w:t xml:space="preserve"> Un usuario es caracterizado por su nombre, apellidos y su email, mientras que un proyecto es caracterizado por su título, su fecha de creación, y la fecha de su descontinuación.</w:t>
-      </w:r>
-      <w:bookmarkStart w:id="3" w:name="_GoBack"/>
-      <w:bookmarkEnd w:id="3"/>
-    </w:p>
-    <w:p>
-      <w:r>
-        <w:t xml:space="preserve">Así mismo, nuestro proyecto está compuesto de tareas. Una tarea existe únicamente dentro de un proyecto, y un proyecto puede tener varias tareas activas en un mismo tiempo. </w:t>
-      </w:r>
-      <w:r>
-        <w:t>De forma adicional, una tarea puede estar asociada a un miembro del equipo.</w:t>
+        <w:t>Nuestro programa gestiona proyectos, que son realizados por los usuarios. Un proyecto puede tener varios usuarios, y un usuario puede estar participando en varios proyectos. Dentro de un proyecto, un usuario puede tener un rol asignado. Un usuario es caracterizado por su nombre, apellidos y su email, mientras que un proyecto es caracterizado por su título, su fecha de creación, y la fecha de su descontinuación.</w:t>
       </w:r>
     </w:p>
     <w:p>
       <w:r>
-        <w:t>Las tareas están caracterizadas por el</w:t>
+        <w:t>Así mismo, nuestro proyecto está compuesto de tareas. Una tarea existe únicamente dentro de un proyecto, y un proyecto puede tener varias tareas activas en un mismo tiempo. De forma adicional, una tarea puede estar asociada a un miembro del equipo.</w:t>
       </w:r>
+    </w:p>
+    <w:p>
       <w:r>
-        <w:t xml:space="preserve"> estado en el que se encuentran, que van a ser principalmente el “</w:t>
+        <w:t>Las tareas están caracterizadas por el estado en el que se encuentran, que van a ser principalmente el “</w:t>
       </w:r>
       <w:proofErr w:type="spellStart"/>
       <w:r>
@@ -1951,13 +1933,13 @@
     </w:p>
     <w:p>
       <w:r>
-        <w:t>Existe, además, un interés por ver la evolución de una tarea a lo largo del tiempo, c</w:t>
-      </w:r>
-      <w:r>
-        <w:t>omo al ver los cambios de estado por lo que esta ha estado.</w:t>
+        <w:t>Existe, además, un interés por ver la evolución de una tarea a lo largo del tiempo, como al ver los cambios de estado por lo que esta ha estado.</w:t>
       </w:r>
     </w:p>
-    <w:p/>
+    <w:p>
+      <w:bookmarkStart w:id="3" w:name="_GoBack"/>
+      <w:bookmarkEnd w:id="3"/>
+    </w:p>
     <w:p/>
     <w:p>
       <w:pPr>
@@ -2186,6 +2168,7 @@
         <w:docPartUnique/>
       </w:docPartObj>
     </w:sdtPr>
+    <w:sdtEndPr/>
     <w:sdtContent>
       <w:p>
         <w:pPr>
@@ -2229,6 +2212,7 @@
             <w:dataBinding w:prefixMappings="xmlns:ns0='http://purl.org/dc/elements/1.1/' xmlns:ns1='http://schemas.openxmlformats.org/package/2006/metadata/core-properties' " w:xpath="/ns1:coreProperties[1]/ns0:subject[1]" w:storeItemID="{6C3C8BC8-F283-45AE-878A-BAB7291924A1}"/>
             <w:text/>
           </w:sdtPr>
+          <w:sdtEndPr/>
           <w:sdtContent>
             <w:r>
               <w:rPr>
@@ -2502,6 +2486,7 @@
         <w:dataBinding w:prefixMappings="xmlns:ns0='http://purl.org/dc/elements/1.1/' xmlns:ns1='http://schemas.openxmlformats.org/package/2006/metadata/core-properties' " w:xpath="/ns1:coreProperties[1]/ns0:title[1]" w:storeItemID="{6C3C8BC8-F283-45AE-878A-BAB7291924A1}"/>
         <w:text/>
       </w:sdtPr>
+      <w:sdtEndPr/>
       <w:sdtContent>
         <w:r>
           <w:rPr>
@@ -2539,6 +2524,7 @@
         <w:dataBinding w:prefixMappings="xmlns:ns0='http://purl.org/dc/elements/1.1/' xmlns:ns1='http://schemas.openxmlformats.org/package/2006/metadata/core-properties' " w:xpath="/ns1:coreProperties[1]/ns0:creator[1]" w:storeItemID="{6C3C8BC8-F283-45AE-878A-BAB7291924A1}"/>
         <w:text/>
       </w:sdtPr>
+      <w:sdtEndPr/>
       <w:sdtContent>
         <w:r>
           <w:rPr>
@@ -4742,6 +4728,7 @@
   </w:compat>
   <w:rsids>
     <w:rsidRoot w:val="005C35FA"/>
+    <w:rsid w:val="00091D29"/>
     <w:rsid w:val="00103937"/>
     <w:rsid w:val="00140856"/>
     <w:rsid w:val="001D5EFE"/>
@@ -5520,7 +5507,7 @@
 </file>
 
 <file path=customXml/itemProps2.xml><?xml version="1.0" encoding="utf-8"?>
-<ds:datastoreItem xmlns:ds="http://schemas.openxmlformats.org/officeDocument/2006/customXml" ds:itemID="{7191FC55-61B7-48B2-88C5-D52CFB0B3A74}">
+<ds:datastoreItem xmlns:ds="http://schemas.openxmlformats.org/officeDocument/2006/customXml" ds:itemID="{78A6286D-551F-4508-9380-C53996B6433B}">
   <ds:schemaRefs>
     <ds:schemaRef ds:uri="http://schemas.openxmlformats.org/officeDocument/2006/bibliography"/>
   </ds:schemaRefs>

</xml_diff>

<commit_message>
Actualizacion de cambios en mi rama
</commit_message>
<xml_diff>
--- a/Documentación SQL/mValiente_jOttonello_mPila_BD_UD4_Proyecto-Transversal.docx
+++ b/Documentación SQL/mValiente_jOttonello_mPila_BD_UD4_Proyecto-Transversal.docx
@@ -266,7 +266,7 @@
                   </wp:anchor>
                 </w:drawing>
               </mc:Choice>
-              <mc:Fallback xmlns:w16sdtfl="http://schemas.microsoft.com/office/word/2024/wordml/sdtformatlock" xmlns:w16sdtdh="http://schemas.microsoft.com/office/word/2020/wordml/sdtdatahash" xmlns:w16du="http://schemas.microsoft.com/office/word/2023/wordml/word16du" xmlns:w16="http://schemas.microsoft.com/office/word/2018/wordml" xmlns:w16cid="http://schemas.microsoft.com/office/word/2016/wordml/cid" xmlns:w16cex="http://schemas.microsoft.com/office/word/2018/wordml/cex" xmlns:oel="http://schemas.microsoft.com/office/2019/extlst" xmlns:am3d="http://schemas.microsoft.com/office/drawing/2017/model3d" xmlns:aink="http://schemas.microsoft.com/office/drawing/2016/ink" xmlns:cx8="http://schemas.microsoft.com/office/drawing/2016/5/14/chartex" xmlns:cx7="http://schemas.microsoft.com/office/drawing/2016/5/13/chartex" xmlns:cx6="http://schemas.microsoft.com/office/drawing/2016/5/12/chartex" xmlns:cx5="http://schemas.microsoft.com/office/drawing/2016/5/11/chartex" xmlns:cx4="http://schemas.microsoft.com/office/drawing/2016/5/10/chartex" xmlns:cx3="http://schemas.microsoft.com/office/drawing/2016/5/9/chartex" xmlns:cx2="http://schemas.microsoft.com/office/drawing/2015/10/21/chartex" xmlns:cx1="http://schemas.microsoft.com/office/drawing/2015/9/8/chartex">
+              <mc:Fallback xmlns:cx1="http://schemas.microsoft.com/office/drawing/2015/9/8/chartex" xmlns:cx2="http://schemas.microsoft.com/office/drawing/2015/10/21/chartex" xmlns:cx3="http://schemas.microsoft.com/office/drawing/2016/5/9/chartex" xmlns:cx4="http://schemas.microsoft.com/office/drawing/2016/5/10/chartex" xmlns:cx5="http://schemas.microsoft.com/office/drawing/2016/5/11/chartex" xmlns:cx6="http://schemas.microsoft.com/office/drawing/2016/5/12/chartex" xmlns:cx7="http://schemas.microsoft.com/office/drawing/2016/5/13/chartex" xmlns:cx8="http://schemas.microsoft.com/office/drawing/2016/5/14/chartex" xmlns:aink="http://schemas.microsoft.com/office/drawing/2016/ink" xmlns:am3d="http://schemas.microsoft.com/office/drawing/2017/model3d" xmlns:oel="http://schemas.microsoft.com/office/2019/extlst" xmlns:w16cex="http://schemas.microsoft.com/office/word/2018/wordml/cex" xmlns:w16cid="http://schemas.microsoft.com/office/word/2016/wordml/cid" xmlns:w16="http://schemas.microsoft.com/office/word/2018/wordml" xmlns:w16du="http://schemas.microsoft.com/office/word/2023/wordml/word16du" xmlns:w16sdtdh="http://schemas.microsoft.com/office/word/2020/wordml/sdtdatahash" xmlns:w16sdtfl="http://schemas.microsoft.com/office/word/2024/wordml/sdtformatlock">
                 <w:pict>
                   <v:group w14:anchorId="464EC05E" id="Grupo 149" o:spid="_x0000_s1026" style="position:absolute;margin-left:0;margin-top:0;width:8in;height:95.7pt;z-index:251662336;mso-width-percent:941;mso-height-percent:121;mso-top-percent:23;mso-position-horizontal:center;mso-position-horizontal-relative:page;mso-position-vertical-relative:page;mso-width-percent:941;mso-height-percent:121;mso-top-percent:23" coordorigin="" coordsize="73152,12161" o:gfxdata="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">
                     <v:shape id="Rectángulo 51" o:spid="_x0000_s1027" style="position:absolute;width:73152;height:11303;visibility:visible;mso-wrap-style:square;v-text-anchor:middle" coordsize="7312660,1129665" o:gfxdata="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" path="m,l7312660,r,1129665l3619500,733425,,1091565,,xe" fillcolor="#5b9bd5 [3204]" stroked="f" strokeweight="1pt">
@@ -1915,7 +1915,13 @@
     </w:p>
     <w:p>
       <w:r>
-        <w:t>Así mismo, nuestro proyecto está compuesto de tareas. Una tarea existe únicamente dentro de un proyecto, y un proyecto puede tener varias tareas activas en un mismo tiempo. De forma adicional, una tarea puede estar asociada a un miembro del equipo.</w:t>
+        <w:t>Así mismo, nuestro proyecto está compuesto de tareas. Una tarea existe únicamente dentro de un proyecto, y un proyecto puede tener varias tareas activas en un mismo tiempo. De forma adicional, una tarea puede estar asociada a un miembro del equipo</w:t>
+      </w:r>
+      <w:r>
+        <w:t xml:space="preserve"> o varios</w:t>
+      </w:r>
+      <w:r>
+        <w:t>.</w:t>
       </w:r>
     </w:p>
     <w:p>
@@ -1930,17 +1936,24 @@
       <w:r>
         <w:t>”, “listo”, “en progreso”, “en revisión” y “hecho”, aunque nos interesa la posibilidad de poder ver a futuro la existencia de nuevas tablas.</w:t>
       </w:r>
+      <w:r>
+        <w:t xml:space="preserve"> Una tarea esta únicamente en un estado en un mismo momento en el tiempo. Además, las tareas tienen una propiedad de prioridad, que por defecto es 0, y cuanto menor el número es, más importante es.</w:t>
+      </w:r>
+      <w:bookmarkStart w:id="3" w:name="_GoBack"/>
+      <w:bookmarkEnd w:id="3"/>
     </w:p>
     <w:p>
       <w:r>
         <w:t>Existe, además, un interés por ver la evolución de una tarea a lo largo del tiempo, como al ver los cambios de estado por lo que esta ha estado.</w:t>
       </w:r>
     </w:p>
+    <w:p/>
+    <w:p/>
     <w:p>
-      <w:bookmarkStart w:id="3" w:name="_GoBack"/>
-      <w:bookmarkEnd w:id="3"/>
+      <w:r>
+        <w:br w:type="page"/>
+      </w:r>
     </w:p>
-    <w:p/>
     <w:p>
       <w:pPr>
         <w:pStyle w:val="Ttulo2"/>
@@ -1951,12 +1964,80 @@
       </w:pPr>
       <w:bookmarkStart w:id="4" w:name="_Toc228867230"/>
       <w:r>
+        <w:lastRenderedPageBreak/>
         <w:t>Diagrama Entidad/Relación</w:t>
       </w:r>
       <w:bookmarkEnd w:id="4"/>
     </w:p>
     <w:p/>
+    <w:p>
+      <w:r>
+        <w:t>Como método de solución al modelo anterior, proponemos el siguiente modelo relacional:</w:t>
+      </w:r>
+    </w:p>
+    <w:p>
+      <w:r>
+        <w:rPr>
+          <w:noProof/>
+          <w:lang w:eastAsia="es-ES"/>
+        </w:rPr>
+        <w:drawing>
+          <wp:anchor distT="0" distB="0" distL="114300" distR="114300" simplePos="0" relativeHeight="251663360" behindDoc="0" locked="0" layoutInCell="1" allowOverlap="1" wp14:anchorId="50EDCE96" wp14:editId="7C9DA2B3">
+            <wp:simplePos x="0" y="0"/>
+            <wp:positionH relativeFrom="margin">
+              <wp:align>center</wp:align>
+            </wp:positionH>
+            <wp:positionV relativeFrom="paragraph">
+              <wp:posOffset>235585</wp:posOffset>
+            </wp:positionV>
+            <wp:extent cx="6181725" cy="5775377"/>
+            <wp:effectExtent l="0" t="0" r="0" b="0"/>
+            <wp:wrapTopAndBottom/>
+            <wp:docPr id="2" name="Imagen 2"/>
+            <wp:cNvGraphicFramePr>
+              <a:graphicFrameLocks xmlns:a="http://schemas.openxmlformats.org/drawingml/2006/main" noChangeAspect="1"/>
+            </wp:cNvGraphicFramePr>
+            <a:graphic xmlns:a="http://schemas.openxmlformats.org/drawingml/2006/main">
+              <a:graphicData uri="http://schemas.openxmlformats.org/drawingml/2006/picture">
+                <pic:pic xmlns:pic="http://schemas.openxmlformats.org/drawingml/2006/picture">
+                  <pic:nvPicPr>
+                    <pic:cNvPr id="2" name="esqE_R.drawio.png"/>
+                    <pic:cNvPicPr/>
+                  </pic:nvPicPr>
+                  <pic:blipFill>
+                    <a:blip r:embed="rId11">
+                      <a:extLst>
+                        <a:ext uri="{28A0092B-C50C-407E-A947-70E740481C1C}">
+                          <a14:useLocalDpi xmlns:a14="http://schemas.microsoft.com/office/drawing/2010/main" val="0"/>
+                        </a:ext>
+                      </a:extLst>
+                    </a:blip>
+                    <a:stretch>
+                      <a:fillRect/>
+                    </a:stretch>
+                  </pic:blipFill>
+                  <pic:spPr>
+                    <a:xfrm>
+                      <a:off x="0" y="0"/>
+                      <a:ext cx="6181725" cy="5775377"/>
+                    </a:xfrm>
+                    <a:prstGeom prst="rect">
+                      <a:avLst/>
+                    </a:prstGeom>
+                  </pic:spPr>
+                </pic:pic>
+              </a:graphicData>
+            </a:graphic>
+          </wp:anchor>
+        </w:drawing>
+      </w:r>
+    </w:p>
     <w:p/>
+    <w:p>
+      <w:r>
+        <w:t xml:space="preserve">No necesitamos crear atributos innecesarios, por lo que nos vamos a ceñir con cada propiedad a lo necesario. Los usuarios tienen un nombre, apellidos y email, participan en proyectos, entrando en este con un rol y saliendo cuando salgan del proyecto. Los proyectos luego tienen una fecha de creación, una fecha de cierre, y un título que les asocia, y estos contienen N tareas que tienen un nombre y un número de prioridad, </w:t>
+      </w:r>
+    </w:p>
     <w:p>
       <w:pPr>
         <w:pStyle w:val="Ttulo2"/>
@@ -1983,6 +2064,7 @@
       </w:pPr>
       <w:bookmarkStart w:id="6" w:name="_Toc228867232"/>
       <w:r>
+        <w:lastRenderedPageBreak/>
         <w:t>Implementación en SQL</w:t>
       </w:r>
       <w:bookmarkEnd w:id="6"/>
@@ -1999,7 +2081,6 @@
       </w:pPr>
       <w:bookmarkStart w:id="7" w:name="_Toc228867233"/>
       <w:r>
-        <w:lastRenderedPageBreak/>
         <w:t>Diagrama de Ingeniería Inversa</w:t>
       </w:r>
       <w:bookmarkEnd w:id="7"/>
@@ -2080,7 +2161,7 @@
           <w:numId w:val="7"/>
         </w:numPr>
       </w:pPr>
-      <w:hyperlink r:id="rId11" w:history="1">
+      <w:hyperlink r:id="rId12" w:history="1">
         <w:r>
           <w:rPr>
             <w:rStyle w:val="Hipervnculo"/>
@@ -2107,8 +2188,8 @@
       </w:pPr>
     </w:p>
     <w:sectPr>
-      <w:headerReference w:type="default" r:id="rId12"/>
-      <w:footerReference w:type="default" r:id="rId13"/>
+      <w:headerReference w:type="default" r:id="rId13"/>
+      <w:footerReference w:type="default" r:id="rId14"/>
       <w:pgSz w:w="11906" w:h="16838"/>
       <w:pgMar w:top="1417" w:right="1701" w:bottom="1417" w:left="1701" w:header="708" w:footer="708" w:gutter="0"/>
       <w:pgNumType w:start="0"/>
@@ -2337,7 +2418,7 @@
                                   <w:sz w:val="28"/>
                                   <w:szCs w:val="28"/>
                                 </w:rPr>
-                                <w:t>4</w:t>
+                                <w:t>3</w:t>
                               </w:r>
                               <w:r>
                                 <w:rPr>
@@ -2413,7 +2494,7 @@
                             <w:sz w:val="28"/>
                             <w:szCs w:val="28"/>
                           </w:rPr>
-                          <w:t>4</w:t>
+                          <w:t>3</w:t>
                         </w:r>
                         <w:r>
                           <w:rPr>
@@ -4751,6 +4832,7 @@
     <w:rsid w:val="00EE3D28"/>
     <w:rsid w:val="00F47488"/>
     <w:rsid w:val="00F61CA0"/>
+    <w:rsid w:val="00FD2B59"/>
   </w:rsids>
   <m:mathPr>
     <m:mathFont m:val="Cambria Math"/>
@@ -5507,7 +5589,7 @@
 </file>
 
 <file path=customXml/itemProps2.xml><?xml version="1.0" encoding="utf-8"?>
-<ds:datastoreItem xmlns:ds="http://schemas.openxmlformats.org/officeDocument/2006/customXml" ds:itemID="{78A6286D-551F-4508-9380-C53996B6433B}">
+<ds:datastoreItem xmlns:ds="http://schemas.openxmlformats.org/officeDocument/2006/customXml" ds:itemID="{41A1EAD8-26B0-40F7-8DE5-A3C716190805}">
   <ds:schemaRefs>
     <ds:schemaRef ds:uri="http://schemas.openxmlformats.org/officeDocument/2006/bibliography"/>
   </ds:schemaRefs>

</xml_diff>